<commit_message>
Worked on Introduction chapter
</commit_message>
<xml_diff>
--- a/thesis/drafts/Diploma Thesis Draft Santeri Paakala.docx
+++ b/thesis/drafts/Diploma Thesis Draft Santeri Paakala.docx
@@ -202,7 +202,7 @@
             </w:rPr>
             <w:fldChar w:fldCharType="separate"/>
           </w:r>
-          <w:hyperlink w:anchor="_Toc243494832" w:history="1">
+          <w:hyperlink w:anchor="_Toc243584093" w:history="1">
             <w:r>
               <w:rPr>
                 <w:rStyle w:val="Hyperlink"/>
@@ -249,7 +249,7 @@
                 <w:noProof/>
                 <w:webHidden/>
               </w:rPr>
-              <w:instrText xml:space="preserve"> PAGEREF _Toc243494832 \h </w:instrText>
+              <w:instrText xml:space="preserve"> PAGEREF _Toc243584093 \h </w:instrText>
             </w:r>
             <w:r>
               <w:rPr>
@@ -295,7 +295,7 @@
               <w14:ligatures w14:val="standardContextual"/>
             </w:rPr>
           </w:pPr>
-          <w:hyperlink w:anchor="_Toc243494833" w:history="1">
+          <w:hyperlink w:anchor="_Toc243584094" w:history="1">
             <w:r>
               <w:rPr>
                 <w:rStyle w:val="Hyperlink"/>
@@ -322,7 +322,7 @@
                 <w:rStyle w:val="Hyperlink"/>
                 <w:noProof/>
               </w:rPr>
-              <w:t>Motivation</w:t>
+              <w:t>Structure</w:t>
             </w:r>
             <w:r>
               <w:rPr>
@@ -343,7 +343,7 @@
                 <w:noProof/>
                 <w:webHidden/>
               </w:rPr>
-              <w:instrText xml:space="preserve"> PAGEREF _Toc243494833 \h </w:instrText>
+              <w:instrText xml:space="preserve"> PAGEREF _Toc243584094 \h </w:instrText>
             </w:r>
             <w:r>
               <w:rPr>
@@ -389,7 +389,7 @@
               <w14:ligatures w14:val="standardContextual"/>
             </w:rPr>
           </w:pPr>
-          <w:hyperlink w:anchor="_Toc243494834" w:history="1">
+          <w:hyperlink w:anchor="_Toc243584095" w:history="1">
             <w:r>
               <w:rPr>
                 <w:rStyle w:val="Hyperlink"/>
@@ -416,7 +416,7 @@
                 <w:rStyle w:val="Hyperlink"/>
                 <w:noProof/>
               </w:rPr>
-              <w:t>Thesis Structure</w:t>
+              <w:t>Motivation</w:t>
             </w:r>
             <w:r>
               <w:rPr>
@@ -437,7 +437,7 @@
                 <w:noProof/>
                 <w:webHidden/>
               </w:rPr>
-              <w:instrText xml:space="preserve"> PAGEREF _Toc243494834 \h </w:instrText>
+              <w:instrText xml:space="preserve"> PAGEREF _Toc243584095 \h </w:instrText>
             </w:r>
             <w:r>
               <w:rPr>
@@ -483,7 +483,7 @@
               <w14:ligatures w14:val="standardContextual"/>
             </w:rPr>
           </w:pPr>
-          <w:hyperlink w:anchor="_Toc243494835" w:history="1">
+          <w:hyperlink w:anchor="_Toc243584096" w:history="1">
             <w:r>
               <w:rPr>
                 <w:rStyle w:val="Hyperlink"/>
@@ -510,7 +510,7 @@
                 <w:rStyle w:val="Hyperlink"/>
                 <w:noProof/>
               </w:rPr>
-              <w:t>Research Questions</w:t>
+              <w:t>Research Methods</w:t>
             </w:r>
             <w:r>
               <w:rPr>
@@ -531,7 +531,7 @@
                 <w:noProof/>
                 <w:webHidden/>
               </w:rPr>
-              <w:instrText xml:space="preserve"> PAGEREF _Toc243494835 \h </w:instrText>
+              <w:instrText xml:space="preserve"> PAGEREF _Toc243584096 \h </w:instrText>
             </w:r>
             <w:r>
               <w:rPr>
@@ -576,7 +576,7 @@
               <w14:ligatures w14:val="standardContextual"/>
             </w:rPr>
           </w:pPr>
-          <w:hyperlink w:anchor="_Toc243494836" w:history="1">
+          <w:hyperlink w:anchor="_Toc243584097" w:history="1">
             <w:r>
               <w:rPr>
                 <w:rStyle w:val="Hyperlink"/>
@@ -602,7 +602,7 @@
                 <w:rStyle w:val="Hyperlink"/>
                 <w:noProof/>
               </w:rPr>
-              <w:t>Selection of Models</w:t>
+              <w:t>Research Questions</w:t>
             </w:r>
             <w:r>
               <w:rPr>
@@ -623,7 +623,7 @@
                 <w:noProof/>
                 <w:webHidden/>
               </w:rPr>
-              <w:instrText xml:space="preserve"> PAGEREF _Toc243494836 \h </w:instrText>
+              <w:instrText xml:space="preserve"> PAGEREF _Toc243584097 \h </w:instrText>
             </w:r>
             <w:r>
               <w:rPr>
@@ -668,7 +668,7 @@
               <w14:ligatures w14:val="standardContextual"/>
             </w:rPr>
           </w:pPr>
-          <w:hyperlink w:anchor="_Toc243494837" w:history="1">
+          <w:hyperlink w:anchor="_Toc243584098" w:history="1">
             <w:r>
               <w:rPr>
                 <w:rStyle w:val="Hyperlink"/>
@@ -694,7 +694,7 @@
                 <w:rStyle w:val="Hyperlink"/>
                 <w:noProof/>
               </w:rPr>
-              <w:t>Model Evaluation Methods</w:t>
+              <w:t>Selection of Models</w:t>
             </w:r>
             <w:r>
               <w:rPr>
@@ -715,7 +715,7 @@
                 <w:noProof/>
                 <w:webHidden/>
               </w:rPr>
-              <w:instrText xml:space="preserve"> PAGEREF _Toc243494837 \h </w:instrText>
+              <w:instrText xml:space="preserve"> PAGEREF _Toc243584098 \h </w:instrText>
             </w:r>
             <w:r>
               <w:rPr>
@@ -760,7 +760,7 @@
               <w14:ligatures w14:val="standardContextual"/>
             </w:rPr>
           </w:pPr>
-          <w:hyperlink w:anchor="_Toc243494838" w:history="1">
+          <w:hyperlink w:anchor="_Toc243584099" w:history="1">
             <w:r>
               <w:rPr>
                 <w:rStyle w:val="Hyperlink"/>
@@ -786,7 +786,7 @@
                 <w:rStyle w:val="Hyperlink"/>
                 <w:noProof/>
               </w:rPr>
-              <w:t>Evaluation of Models</w:t>
+              <w:t>Model Evaluation Methods</w:t>
             </w:r>
             <w:r>
               <w:rPr>
@@ -807,7 +807,7 @@
                 <w:noProof/>
                 <w:webHidden/>
               </w:rPr>
-              <w:instrText xml:space="preserve"> PAGEREF _Toc243494838 \h </w:instrText>
+              <w:instrText xml:space="preserve"> PAGEREF _Toc243584099 \h </w:instrText>
             </w:r>
             <w:r>
               <w:rPr>
@@ -852,7 +852,7 @@
               <w14:ligatures w14:val="standardContextual"/>
             </w:rPr>
           </w:pPr>
-          <w:hyperlink w:anchor="_Toc243494839" w:history="1">
+          <w:hyperlink w:anchor="_Toc243584100" w:history="1">
             <w:r>
               <w:rPr>
                 <w:rStyle w:val="Hyperlink"/>
@@ -878,7 +878,7 @@
                 <w:rStyle w:val="Hyperlink"/>
                 <w:noProof/>
               </w:rPr>
-              <w:t>Results</w:t>
+              <w:t>Evaluation of Models</w:t>
             </w:r>
             <w:r>
               <w:rPr>
@@ -899,7 +899,7 @@
                 <w:noProof/>
                 <w:webHidden/>
               </w:rPr>
-              <w:instrText xml:space="preserve"> PAGEREF _Toc243494839 \h </w:instrText>
+              <w:instrText xml:space="preserve"> PAGEREF _Toc243584100 \h </w:instrText>
             </w:r>
             <w:r>
               <w:rPr>
@@ -944,7 +944,7 @@
               <w14:ligatures w14:val="standardContextual"/>
             </w:rPr>
           </w:pPr>
-          <w:hyperlink w:anchor="_Toc243494840" w:history="1">
+          <w:hyperlink w:anchor="_Toc243584101" w:history="1">
             <w:r>
               <w:rPr>
                 <w:rStyle w:val="Hyperlink"/>
@@ -970,7 +970,7 @@
                 <w:rStyle w:val="Hyperlink"/>
                 <w:noProof/>
               </w:rPr>
-              <w:t>Summary</w:t>
+              <w:t>Results</w:t>
             </w:r>
             <w:r>
               <w:rPr>
@@ -991,7 +991,7 @@
                 <w:noProof/>
                 <w:webHidden/>
               </w:rPr>
-              <w:instrText xml:space="preserve"> PAGEREF _Toc243494840 \h </w:instrText>
+              <w:instrText xml:space="preserve"> PAGEREF _Toc243584101 \h </w:instrText>
             </w:r>
             <w:r>
               <w:rPr>
@@ -1036,12 +1036,104 @@
               <w14:ligatures w14:val="standardContextual"/>
             </w:rPr>
           </w:pPr>
-          <w:hyperlink w:anchor="_Toc243494841" w:history="1">
+          <w:hyperlink w:anchor="_Toc243584102" w:history="1">
             <w:r>
               <w:rPr>
                 <w:rStyle w:val="Hyperlink"/>
                 <w:noProof/>
               </w:rPr>
+              <w:t>7.</w:t>
+            </w:r>
+            <w:r>
+              <w:rPr>
+                <w:rFonts w:asciiTheme="minorHAnsi" w:eastAsiaTheme="minorEastAsia" w:hAnsiTheme="minorHAnsi" w:cstheme="minorBidi"/>
+                <w:b w:val="0"/>
+                <w:bCs w:val="0"/>
+                <w:iCs w:val="0"/>
+                <w:noProof/>
+                <w:kern w:val="2"/>
+                <w:lang w:val="en-US"/>
+                <w14:ligatures w14:val="standardContextual"/>
+              </w:rPr>
+              <w:tab/>
+            </w:r>
+            <w:r>
+              <w:rPr>
+                <w:rStyle w:val="Hyperlink"/>
+                <w:noProof/>
+              </w:rPr>
+              <w:t>Summary</w:t>
+            </w:r>
+            <w:r>
+              <w:rPr>
+                <w:noProof/>
+                <w:webHidden/>
+              </w:rPr>
+              <w:tab/>
+            </w:r>
+            <w:r>
+              <w:rPr>
+                <w:noProof/>
+                <w:webHidden/>
+              </w:rPr>
+              <w:fldChar w:fldCharType="begin"/>
+            </w:r>
+            <w:r>
+              <w:rPr>
+                <w:noProof/>
+                <w:webHidden/>
+              </w:rPr>
+              <w:instrText xml:space="preserve"> PAGEREF _Toc243584102 \h </w:instrText>
+            </w:r>
+            <w:r>
+              <w:rPr>
+                <w:noProof/>
+                <w:webHidden/>
+              </w:rPr>
+            </w:r>
+            <w:r>
+              <w:rPr>
+                <w:noProof/>
+                <w:webHidden/>
+              </w:rPr>
+              <w:fldChar w:fldCharType="separate"/>
+            </w:r>
+            <w:r>
+              <w:rPr>
+                <w:noProof/>
+                <w:webHidden/>
+              </w:rPr>
+              <w:t>10</w:t>
+            </w:r>
+            <w:r>
+              <w:rPr>
+                <w:noProof/>
+                <w:webHidden/>
+              </w:rPr>
+              <w:fldChar w:fldCharType="end"/>
+            </w:r>
+          </w:hyperlink>
+        </w:p>
+        <w:p>
+          <w:pPr>
+            <w:pStyle w:val="TOC1"/>
+            <w:rPr>
+              <w:rFonts w:asciiTheme="minorHAnsi" w:eastAsiaTheme="minorEastAsia" w:hAnsiTheme="minorHAnsi" w:cstheme="minorBidi"/>
+              <w:b w:val="0"/>
+              <w:bCs w:val="0"/>
+              <w:iCs w:val="0"/>
+              <w:noProof/>
+              <w:kern w:val="2"/>
+              <w:lang w:val="en-US"/>
+              <w14:ligatures w14:val="standardContextual"/>
+            </w:rPr>
+          </w:pPr>
+          <w:hyperlink w:anchor="_Toc243584103" w:history="1">
+            <w:r>
+              <w:rPr>
+                <w:rStyle w:val="Hyperlink"/>
+                <w:noProof/>
+              </w:rPr>
               <w:t>References</w:t>
             </w:r>
             <w:r>
@@ -1063,7 +1155,7 @@
                 <w:noProof/>
                 <w:webHidden/>
               </w:rPr>
-              <w:instrText xml:space="preserve"> PAGEREF _Toc243494841 \h </w:instrText>
+              <w:instrText xml:space="preserve"> PAGEREF _Toc243584103 \h </w:instrText>
             </w:r>
             <w:r>
               <w:rPr>
@@ -1083,7 +1175,7 @@
                 <w:noProof/>
                 <w:webHidden/>
               </w:rPr>
-              <w:t>10</w:t>
+              <w:t>11</w:t>
             </w:r>
             <w:r>
               <w:rPr>
@@ -1127,7 +1219,7 @@
           <w:numId w:val="3"/>
         </w:numPr>
       </w:pPr>
-      <w:bookmarkStart w:id="0" w:name="_Toc243494832"/>
+      <w:bookmarkStart w:id="0" w:name="_Toc243584093"/>
       <w:r>
         <w:lastRenderedPageBreak/>
         <w:t>Introduction</w:t>
@@ -1198,16 +1290,15 @@
         </w:tabs>
         <w:ind w:left="792" w:hanging="432"/>
       </w:pPr>
+      <w:bookmarkStart w:id="1" w:name="_Toc243584094"/>
       <w:r>
         <w:t>Structure</w:t>
       </w:r>
+      <w:bookmarkEnd w:id="1"/>
     </w:p>
     <w:p>
       <w:r>
-        <w:t>This introduction covers the motivation and research questions of the thesis.</w:t>
-      </w:r>
-      <w:r>
-        <w:t xml:space="preserve"> </w:t>
+        <w:t xml:space="preserve">This introduction covers the motivation and research questions of the thesis. </w:t>
       </w:r>
       <w:r>
         <w:t xml:space="preserve">The next chapter discusses why </w:t>
@@ -1233,11 +1324,11 @@
         </w:tabs>
         <w:ind w:left="792" w:hanging="432"/>
       </w:pPr>
-      <w:bookmarkStart w:id="1" w:name="_Toc243494833"/>
+      <w:bookmarkStart w:id="2" w:name="_Toc243584095"/>
       <w:r>
         <w:t>Motivation</w:t>
       </w:r>
-      <w:bookmarkEnd w:id="1"/>
+      <w:bookmarkEnd w:id="2"/>
     </w:p>
     <w:p>
       <w:r>
@@ -1322,29 +1413,9 @@
         </w:tabs>
         <w:ind w:left="792" w:hanging="432"/>
       </w:pPr>
+      <w:bookmarkStart w:id="3" w:name="_Toc243584096"/>
       <w:r>
         <w:t>Research Methods</w:t>
-      </w:r>
-    </w:p>
-    <w:p>
-      <w:pPr>
-        <w:pStyle w:val="Heading1"/>
-      </w:pPr>
-      <w:bookmarkStart w:id="2" w:name="_Toc243494835"/>
-      <w:r>
-        <w:lastRenderedPageBreak/>
-        <w:t>Research Questions</w:t>
-      </w:r>
-      <w:bookmarkEnd w:id="2"/>
-    </w:p>
-    <w:p>
-      <w:pPr>
-        <w:pStyle w:val="Heading1"/>
-      </w:pPr>
-      <w:bookmarkStart w:id="3" w:name="_Toc243494836"/>
-      <w:r>
-        <w:lastRenderedPageBreak/>
-        <w:t>Selection of Models</w:t>
       </w:r>
       <w:bookmarkEnd w:id="3"/>
     </w:p>
@@ -1352,10 +1423,10 @@
       <w:pPr>
         <w:pStyle w:val="Heading1"/>
       </w:pPr>
-      <w:bookmarkStart w:id="4" w:name="_Toc243494837"/>
+      <w:bookmarkStart w:id="4" w:name="_Toc243584097"/>
       <w:r>
         <w:lastRenderedPageBreak/>
-        <w:t>Model Evaluation Methods</w:t>
+        <w:t>Research Questions</w:t>
       </w:r>
       <w:bookmarkEnd w:id="4"/>
     </w:p>
@@ -1363,21 +1434,24 @@
       <w:pPr>
         <w:pStyle w:val="Heading1"/>
       </w:pPr>
-      <w:bookmarkStart w:id="5" w:name="_Toc243494838"/>
+      <w:bookmarkStart w:id="5" w:name="_Toc243584098"/>
       <w:r>
         <w:lastRenderedPageBreak/>
-        <w:t>Evaluation of Models</w:t>
+        <w:t>Model</w:t>
       </w:r>
       <w:bookmarkEnd w:id="5"/>
+      <w:r>
+        <w:t xml:space="preserve"> Selection</w:t>
+      </w:r>
     </w:p>
     <w:p>
       <w:pPr>
         <w:pStyle w:val="Heading1"/>
       </w:pPr>
-      <w:bookmarkStart w:id="6" w:name="_Toc243494839"/>
+      <w:bookmarkStart w:id="6" w:name="_Toc243584099"/>
       <w:r>
         <w:lastRenderedPageBreak/>
-        <w:t>Results</w:t>
+        <w:t>Model Evaluation Methods</w:t>
       </w:r>
       <w:bookmarkEnd w:id="6"/>
     </w:p>
@@ -1385,12 +1459,37 @@
       <w:pPr>
         <w:pStyle w:val="Heading1"/>
       </w:pPr>
-      <w:bookmarkStart w:id="7" w:name="_Toc243494840"/>
+      <w:bookmarkStart w:id="7" w:name="_Toc243584100"/>
+      <w:r>
+        <w:lastRenderedPageBreak/>
+        <w:t>Model</w:t>
+      </w:r>
+      <w:bookmarkEnd w:id="7"/>
+      <w:r>
+        <w:t xml:space="preserve"> Evaluation</w:t>
+      </w:r>
+    </w:p>
+    <w:p>
+      <w:pPr>
+        <w:pStyle w:val="Heading1"/>
+      </w:pPr>
+      <w:bookmarkStart w:id="8" w:name="_Toc243584101"/>
+      <w:r>
+        <w:lastRenderedPageBreak/>
+        <w:t>Results</w:t>
+      </w:r>
+      <w:bookmarkEnd w:id="8"/>
+    </w:p>
+    <w:p>
+      <w:pPr>
+        <w:pStyle w:val="Heading1"/>
+      </w:pPr>
+      <w:bookmarkStart w:id="9" w:name="_Toc243584102"/>
       <w:r>
         <w:lastRenderedPageBreak/>
         <w:t>Summary</w:t>
       </w:r>
-      <w:bookmarkEnd w:id="7"/>
+      <w:bookmarkEnd w:id="9"/>
     </w:p>
     <w:p>
       <w:pPr>
@@ -1414,12 +1513,12 @@
           <w:numId w:val="0"/>
         </w:numPr>
       </w:pPr>
-      <w:bookmarkStart w:id="8" w:name="_Toc243494841"/>
+      <w:bookmarkStart w:id="10" w:name="_Toc243584103"/>
       <w:r>
         <w:lastRenderedPageBreak/>
         <w:t>References</w:t>
       </w:r>
-      <w:bookmarkEnd w:id="8"/>
+      <w:bookmarkEnd w:id="10"/>
     </w:p>
     <w:sectPr>
       <w:headerReference w:type="default" r:id="rId11"/>
@@ -1658,6 +1757,7 @@
     <w:lvl w:ilvl="1">
       <w:start w:val="1"/>
       <w:numFmt w:val="decimal"/>
+      <w:pStyle w:val="Heading2"/>
       <w:lvlText w:val="%1.%2."/>
       <w:lvlJc w:val="left"/>
       <w:pPr>
@@ -1667,6 +1767,7 @@
     <w:lvl w:ilvl="2">
       <w:start w:val="1"/>
       <w:numFmt w:val="decimal"/>
+      <w:pStyle w:val="Heading3"/>
       <w:lvlText w:val="%1.%2.%3."/>
       <w:lvlJc w:val="left"/>
       <w:pPr>
@@ -1676,6 +1777,7 @@
     <w:lvl w:ilvl="3">
       <w:start w:val="1"/>
       <w:numFmt w:val="decimal"/>
+      <w:pStyle w:val="Heading4"/>
       <w:lvlText w:val="%1.%2.%3.%4."/>
       <w:lvlJc w:val="left"/>
       <w:pPr>
@@ -1744,7 +1846,6 @@
     <w:lvl w:ilvl="1">
       <w:start w:val="1"/>
       <w:numFmt w:val="decimal"/>
-      <w:pStyle w:val="Heading2"/>
       <w:lvlText w:val="%1.%2"/>
       <w:lvlJc w:val="left"/>
       <w:pPr>
@@ -1754,7 +1855,6 @@
     <w:lvl w:ilvl="2">
       <w:start w:val="1"/>
       <w:numFmt w:val="decimal"/>
-      <w:pStyle w:val="Heading3"/>
       <w:lvlText w:val="%1.%2.%3"/>
       <w:lvlJc w:val="left"/>
       <w:pPr>
@@ -1764,7 +1864,6 @@
     <w:lvl w:ilvl="3">
       <w:start w:val="1"/>
       <w:numFmt w:val="decimal"/>
-      <w:pStyle w:val="Heading4"/>
       <w:lvlText w:val="%1.%2.%3.%4"/>
       <w:lvlJc w:val="left"/>
       <w:pPr>

</xml_diff>